<commit_message>
feat: add status_pernikahan column to pengajuan_sidang_kaprodi table and update related functionality feat: update document generation for LEMBAR_PERMOHONAN_UJIAN and SURAT_PERNYATAAN_PERBAIKAN to include status_pernikahan fix: correct formatting in template_permohonan_ujian_skripsi and template_usulan_penguji documents
</commit_message>
<xml_diff>
--- a/src/templates/template_permohonan_ujian_skripsi.docx
+++ b/src/templates/template_permohonan_ujian_skripsi.docx
@@ -660,19 +660,7 @@
         <w:rPr>
           <w:sz w:val="24"/>
         </w:rPr>
-        <w:t>{{</w:t>
-      </w:r>
-      <w:r>
-        <w:rPr>
-          <w:sz w:val="24"/>
-        </w:rPr>
-        <w:t>no_hp</w:t>
-      </w:r>
-      <w:r>
-        <w:rPr>
-          <w:sz w:val="24"/>
-        </w:rPr>
-        <w:t>}}</w:t>
+        <w:t>{{no_hp}}</w:t>
       </w:r>
       <w:r>
         <w:rPr>
@@ -705,19 +693,7 @@
         <w:rPr>
           <w:sz w:val="24"/>
         </w:rPr>
-        <w:t>{{</w:t>
-      </w:r>
-      <w:r>
-        <w:rPr>
-          <w:sz w:val="24"/>
-        </w:rPr>
-        <w:t>no_wa</w:t>
-      </w:r>
-      <w:r>
-        <w:rPr>
-          <w:sz w:val="24"/>
-        </w:rPr>
-        <w:t>}}</w:t>
+        <w:t>{{no_wa}}</w:t>
       </w:r>
       <w:r>
         <w:rPr>
@@ -750,7 +726,7 @@
         <w:rPr>
           <w:sz w:val="24"/>
         </w:rPr>
-        <w:t>{{no_wa}}</w:t>
+        <w:t>{{status}}</w:t>
       </w:r>
     </w:p>
     <w:p>
@@ -935,7 +911,28 @@
           <w:spacing w:val="-10"/>
           <w:sz w:val="24"/>
         </w:rPr>
-        <w:t>{{judul}}</w:t>
+        <w:t>{{</w:t>
+      </w:r>
+      <w:r>
+        <w:rPr>
+          <w:spacing w:val="10"/>
+          <w:sz w:val="24"/>
+        </w:rPr>
+        <w:t>judu</w:t>
+      </w:r>
+      <w:r>
+        <w:rPr>
+          <w:spacing w:val="10"/>
+          <w:sz w:val="24"/>
+        </w:rPr>
+        <w:t>l_skripsi</w:t>
+      </w:r>
+      <w:r>
+        <w:rPr>
+          <w:spacing w:val="-10"/>
+          <w:sz w:val="24"/>
+        </w:rPr>
+        <w:t>}}</w:t>
       </w:r>
     </w:p>
     <w:p>

</xml_diff>